<commit_message>
feat : update portfolio in resume
</commit_message>
<xml_diff>
--- a/resume/Aman_Sinha_Resume.docx
+++ b/resume/Aman_Sinha_Resume.docx
@@ -60,9 +60,48 @@
           <w:sz w:val="18"/>
           <w:szCs w:val="18"/>
         </w:rPr>
-        <w:t xml:space="preserve">   |   +91-7557839800   |   Kolkata, West Bengal    |   </w:t>
+        <w:t xml:space="preserve">   |   +91-7557839800   |   Kolkata, West Bengal    | </w:t>
+      </w:r>
+      <w:r>
+        <w:rPr>
+          <w:rFonts w:ascii="Arial" w:eastAsia="Arial" w:hAnsi="Arial" w:cs="Arial"/>
+          <w:color w:val="595959"/>
+          <w:sz w:val="18"/>
+          <w:szCs w:val="18"/>
+        </w:rPr>
+        <w:t xml:space="preserve">     </w:t>
       </w:r>
       <w:hyperlink r:id="rId6" w:history="1">
+        <w:r>
+          <w:rPr>
+            <w:rFonts w:ascii="Arial" w:eastAsia="Arial" w:hAnsi="Arial" w:cs="Arial"/>
+            <w:color w:val="595959"/>
+            <w:sz w:val="18"/>
+            <w:szCs w:val="18"/>
+            <w:u w:val="single"/>
+          </w:rPr>
+          <w:t>Portfolio</w:t>
+        </w:r>
+      </w:hyperlink>
+      <w:r>
+        <w:rPr>
+          <w:rFonts w:ascii="Arial" w:eastAsia="Arial" w:hAnsi="Arial" w:cs="Arial"/>
+          <w:color w:val="595959"/>
+          <w:sz w:val="18"/>
+          <w:szCs w:val="18"/>
+        </w:rPr>
+        <w:t xml:space="preserve">   |   </w:t>
+      </w:r>
+      <w:r>
+        <w:rPr>
+          <w:rFonts w:ascii="Arial" w:eastAsia="Arial" w:hAnsi="Arial" w:cs="Arial"/>
+          <w:color w:val="595959"/>
+          <w:sz w:val="18"/>
+          <w:szCs w:val="18"/>
+        </w:rPr>
+        <w:t xml:space="preserve">  </w:t>
+      </w:r>
+      <w:hyperlink r:id="rId7" w:history="1">
         <w:r>
           <w:rPr>
             <w:rFonts w:ascii="Arial" w:eastAsia="Arial" w:hAnsi="Arial" w:cs="Arial"/>
@@ -83,7 +122,7 @@
         </w:rPr>
         <w:t xml:space="preserve">   |   </w:t>
       </w:r>
-      <w:hyperlink r:id="rId7" w:history="1">
+      <w:hyperlink r:id="rId8" w:history="1">
         <w:r>
           <w:rPr>
             <w:rFonts w:ascii="Arial" w:eastAsia="Arial" w:hAnsi="Arial" w:cs="Arial"/>
@@ -2227,6 +2266,29 @@
       <w:szCs w:val="48"/>
     </w:rPr>
   </w:style>
+  <w:style w:type="character" w:styleId="Hyperlink">
+    <w:name w:val="Hyperlink"/>
+    <w:basedOn w:val="DefaultParagraphFont"/>
+    <w:uiPriority w:val="99"/>
+    <w:unhideWhenUsed/>
+    <w:rsid w:val="004F092B"/>
+    <w:rPr>
+      <w:color w:val="0000FF" w:themeColor="hyperlink"/>
+      <w:u w:val="single"/>
+    </w:rPr>
+  </w:style>
+  <w:style w:type="character" w:styleId="UnresolvedMention">
+    <w:name w:val="Unresolved Mention"/>
+    <w:basedOn w:val="DefaultParagraphFont"/>
+    <w:uiPriority w:val="99"/>
+    <w:semiHidden/>
+    <w:unhideWhenUsed/>
+    <w:rsid w:val="004F092B"/>
+    <w:rPr>
+      <w:color w:val="605E5C"/>
+      <w:shd w:val="clear" w:color="auto" w:fill="E1DFDD"/>
+    </w:rPr>
+  </w:style>
 </w:styles>
 </file>
 

</xml_diff>